<commit_message>
Added release notes for 3.26.0
</commit_message>
<xml_diff>
--- a/doc/release/HPC DME Release Notes 3.26.0.docx
+++ b/doc/release/HPC DME Release Notes 3.26.0.docx
@@ -4016,92 +4016,6 @@
           </w:p>
           <w:p>
             <w:pPr>
-              <w:pStyle w:val="Heading2"/>
-              <w:rPr>
-                <w:rFonts w:ascii="Aptos" w:hAnsi="Aptos" w:cstheme="minorHAnsi"/>
-                <w:color w:val="000000" w:themeColor="text1"/>
-                <w:sz w:val="22"/>
-                <w:szCs w:val="22"/>
-              </w:rPr>
-            </w:pPr>
-            <w:r>
-              <w:rPr>
-                <w:rFonts w:ascii="Aptos" w:eastAsiaTheme="minorHAnsi" w:hAnsi="Aptos" w:cs="AppleSystemUIFont"/>
-                <w:color w:val="000000" w:themeColor="text1"/>
-                <w:sz w:val="22"/>
-                <w:szCs w:val="22"/>
-                <w:u w:val="single"/>
-              </w:rPr>
-              <w:t>DMESUPPORT-1</w:t>
-            </w:r>
-            <w:r>
-              <w:rPr>
-                <w:rFonts w:ascii="Aptos" w:eastAsiaTheme="minorHAnsi" w:hAnsi="Aptos" w:cs="AppleSystemUIFont"/>
-                <w:color w:val="000000" w:themeColor="text1"/>
-                <w:sz w:val="22"/>
-                <w:szCs w:val="22"/>
-                <w:u w:val="single"/>
-              </w:rPr>
-              <w:t>7</w:t>
-            </w:r>
-            <w:r>
-              <w:rPr>
-                <w:rFonts w:ascii="Aptos" w:eastAsiaTheme="minorHAnsi" w:hAnsi="Aptos" w:cs="AppleSystemUIFont"/>
-                <w:color w:val="000000" w:themeColor="text1"/>
-                <w:sz w:val="22"/>
-                <w:szCs w:val="22"/>
-                <w:u w:val="single"/>
-              </w:rPr>
-              <w:t>4</w:t>
-            </w:r>
-            <w:r>
-              <w:rPr>
-                <w:rFonts w:ascii="Aptos" w:eastAsiaTheme="minorHAnsi" w:hAnsi="Aptos" w:cs="AppleSystemUIFont"/>
-                <w:color w:val="000000" w:themeColor="text1"/>
-                <w:sz w:val="22"/>
-                <w:szCs w:val="22"/>
-              </w:rPr>
-              <w:t xml:space="preserve">: </w:t>
-            </w:r>
-            <w:r>
-              <w:rPr>
-                <w:rFonts w:ascii="Aptos" w:hAnsi="Aptos"/>
-                <w:color w:val="000000" w:themeColor="text1"/>
-                <w:sz w:val="22"/>
-                <w:szCs w:val="22"/>
-              </w:rPr>
-              <w:t>Enhance</w:t>
-            </w:r>
-            <w:r>
-              <w:rPr>
-                <w:rFonts w:ascii="Aptos" w:hAnsi="Aptos"/>
-                <w:color w:val="000000" w:themeColor="text1"/>
-                <w:sz w:val="22"/>
-                <w:szCs w:val="22"/>
-              </w:rPr>
-              <w:t>d</w:t>
-            </w:r>
-            <w:r>
-              <w:rPr>
-                <w:rFonts w:ascii="Aptos" w:hAnsi="Aptos"/>
-                <w:color w:val="000000" w:themeColor="text1"/>
-                <w:sz w:val="22"/>
-                <w:szCs w:val="22"/>
-              </w:rPr>
-              <w:t xml:space="preserve"> the DME archival workflow framework to </w:t>
-            </w:r>
-            <w:r>
-              <w:rPr>
-                <w:rFonts w:ascii="Aptos" w:hAnsi="Aptos"/>
-                <w:color w:val="000000" w:themeColor="text1"/>
-                <w:sz w:val="22"/>
-                <w:szCs w:val="22"/>
-              </w:rPr>
-              <w:t xml:space="preserve">identify and eliminate duplicate symbolic links during tarring for archival. </w:t>
-            </w:r>
-          </w:p>
-          <w:p>
-            <w:pPr>
               <w:pStyle w:val="NormalWeb"/>
               <w:spacing w:after="240" w:afterAutospacing="0"/>
               <w:rPr>
@@ -4249,24 +4163,192 @@
             <w:pPr>
               <w:rPr>
                 <w:rFonts w:ascii="Aptos" w:hAnsi="Aptos"/>
+                <w:sz w:val="22"/>
+                <w:szCs w:val="22"/>
+              </w:rPr>
+            </w:pPr>
+            <w:r>
+              <w:rPr>
+                <w:rFonts w:ascii="Aptos" w:hAnsi="Aptos"/>
+                <w:sz w:val="22"/>
+                <w:szCs w:val="22"/>
+                <w:u w:val="single"/>
+              </w:rPr>
+              <w:t xml:space="preserve">HPCDATAMGM-2192: </w:t>
+            </w:r>
+            <w:r>
+              <w:rPr>
+                <w:rFonts w:ascii="Aptos" w:hAnsi="Aptos"/>
+                <w:sz w:val="22"/>
+                <w:szCs w:val="22"/>
+                <w:u w:val="single"/>
+              </w:rPr>
+              <w:t xml:space="preserve"> </w:t>
+            </w:r>
+            <w:r>
+              <w:rPr>
+                <w:rFonts w:ascii="Aptos" w:hAnsi="Aptos"/>
+                <w:sz w:val="22"/>
+                <w:szCs w:val="22"/>
+              </w:rPr>
+              <w:t xml:space="preserve">Fixed issue with adding permissions </w:t>
+            </w:r>
+            <w:r>
+              <w:rPr>
+                <w:rFonts w:ascii="Aptos" w:hAnsi="Aptos"/>
+                <w:sz w:val="22"/>
+                <w:szCs w:val="22"/>
+              </w:rPr>
+              <w:t xml:space="preserve">for more than 21 users </w:t>
+            </w:r>
+            <w:r>
+              <w:rPr>
+                <w:rFonts w:ascii="Aptos" w:hAnsi="Aptos"/>
+                <w:sz w:val="22"/>
+                <w:szCs w:val="22"/>
+              </w:rPr>
+              <w:t xml:space="preserve">to a </w:t>
+            </w:r>
+            <w:r>
+              <w:rPr>
+                <w:rFonts w:ascii="Aptos" w:hAnsi="Aptos"/>
+                <w:sz w:val="22"/>
+                <w:szCs w:val="22"/>
+              </w:rPr>
+              <w:t xml:space="preserve">file or </w:t>
+            </w:r>
+            <w:r>
+              <w:rPr>
+                <w:rFonts w:ascii="Aptos" w:hAnsi="Aptos"/>
+                <w:sz w:val="22"/>
+                <w:szCs w:val="22"/>
+              </w:rPr>
+              <w:t>collection in the DME web application.</w:t>
+            </w:r>
+          </w:p>
+          <w:p>
+            <w:pPr>
+              <w:rPr>
+                <w:rFonts w:ascii="Aptos" w:hAnsi="Aptos"/>
+                <w:sz w:val="22"/>
+                <w:szCs w:val="22"/>
+                <w:u w:val="single"/>
+              </w:rPr>
+            </w:pPr>
+          </w:p>
+          <w:p>
+            <w:pPr>
+              <w:rPr>
+                <w:rFonts w:ascii="Aptos" w:hAnsi="Aptos"/>
+                <w:sz w:val="22"/>
+                <w:szCs w:val="22"/>
+              </w:rPr>
+            </w:pPr>
+            <w:r>
+              <w:rPr>
+                <w:rFonts w:ascii="Aptos" w:hAnsi="Aptos"/>
+                <w:sz w:val="22"/>
+                <w:szCs w:val="22"/>
+                <w:u w:val="single"/>
+              </w:rPr>
+              <w:t>HPCDATAMGM-2195</w:t>
+            </w:r>
+            <w:r>
+              <w:rPr>
+                <w:rFonts w:ascii="Aptos" w:hAnsi="Aptos"/>
                 <w:b/>
                 <w:bCs/>
                 <w:sz w:val="22"/>
                 <w:szCs w:val="22"/>
                 <w:u w:val="single"/>
               </w:rPr>
-            </w:pPr>
-          </w:p>
-          <w:p>
-            <w:pPr>
-              <w:rPr>
-                <w:rFonts w:ascii="Aptos" w:hAnsi="Aptos"/>
-                <w:color w:val="0E101A"/>
-                <w:sz w:val="22"/>
-                <w:szCs w:val="22"/>
-              </w:rPr>
-            </w:pPr>
-            <w:r>
+              <w:t xml:space="preserve">:  </w:t>
+            </w:r>
+            <w:r>
+              <w:rPr>
+                <w:rFonts w:ascii="Aptos" w:hAnsi="Aptos"/>
+                <w:sz w:val="22"/>
+                <w:szCs w:val="22"/>
+              </w:rPr>
+              <w:t xml:space="preserve">Fixed </w:t>
+            </w:r>
+            <w:r>
+              <w:rPr>
+                <w:rFonts w:ascii="Aptos" w:hAnsi="Aptos"/>
+                <w:sz w:val="22"/>
+                <w:szCs w:val="22"/>
+              </w:rPr>
+              <w:t xml:space="preserve">the </w:t>
+            </w:r>
+            <w:r>
+              <w:rPr>
+                <w:rFonts w:ascii="Aptos" w:hAnsi="Aptos"/>
+                <w:sz w:val="22"/>
+                <w:szCs w:val="22"/>
+              </w:rPr>
+              <w:t xml:space="preserve">issue </w:t>
+            </w:r>
+            <w:r>
+              <w:rPr>
+                <w:rFonts w:ascii="Aptos" w:hAnsi="Aptos"/>
+                <w:sz w:val="22"/>
+                <w:szCs w:val="22"/>
+              </w:rPr>
+              <w:t>of</w:t>
+            </w:r>
+            <w:r>
+              <w:rPr>
+                <w:rFonts w:ascii="Aptos" w:hAnsi="Aptos"/>
+                <w:sz w:val="22"/>
+                <w:szCs w:val="22"/>
+              </w:rPr>
+              <w:t xml:space="preserve"> </w:t>
+            </w:r>
+            <w:r>
+              <w:rPr>
+                <w:rFonts w:ascii="Aptos" w:hAnsi="Aptos"/>
+                <w:sz w:val="22"/>
+                <w:szCs w:val="22"/>
+              </w:rPr>
+              <w:t xml:space="preserve">errors occurring </w:t>
+            </w:r>
+            <w:r>
+              <w:rPr>
+                <w:rFonts w:ascii="Aptos" w:hAnsi="Aptos"/>
+                <w:sz w:val="22"/>
+                <w:szCs w:val="22"/>
+              </w:rPr>
+              <w:t xml:space="preserve">intermittently </w:t>
+            </w:r>
+            <w:r>
+              <w:rPr>
+                <w:rFonts w:ascii="Aptos" w:hAnsi="Aptos"/>
+                <w:sz w:val="22"/>
+                <w:szCs w:val="22"/>
+              </w:rPr>
+              <w:t xml:space="preserve">during </w:t>
+            </w:r>
+            <w:r>
+              <w:rPr>
+                <w:rFonts w:ascii="Aptos" w:hAnsi="Aptos"/>
+                <w:sz w:val="22"/>
+                <w:szCs w:val="22"/>
+              </w:rPr>
+              <w:t>Globus transactions due to a change in a Globus error code.</w:t>
+            </w:r>
+          </w:p>
+          <w:p>
+            <w:pPr>
+              <w:rPr>
+                <w:rFonts w:ascii="Aptos" w:hAnsi="Aptos"/>
+                <w:sz w:val="22"/>
+                <w:szCs w:val="22"/>
+                <w:u w:val="single"/>
+              </w:rPr>
+            </w:pPr>
+          </w:p>
+          <w:p>
+            <w:pPr>
               <w:rPr>
                 <w:rFonts w:ascii="Aptos" w:hAnsi="Aptos"/>
                 <w:b/>
@@ -4275,8 +4357,17 @@
                 <w:szCs w:val="22"/>
                 <w:u w:val="single"/>
               </w:rPr>
-              <w:t>Operatio</w:t>
-            </w:r>
+            </w:pPr>
+          </w:p>
+          <w:p>
+            <w:pPr>
+              <w:rPr>
+                <w:rFonts w:ascii="Aptos" w:hAnsi="Aptos"/>
+                <w:color w:val="0E101A"/>
+                <w:sz w:val="22"/>
+                <w:szCs w:val="22"/>
+              </w:rPr>
+            </w:pPr>
             <w:r>
               <w:rPr>
                 <w:rFonts w:ascii="Aptos" w:hAnsi="Aptos"/>
@@ -4286,7 +4377,7 @@
                 <w:szCs w:val="22"/>
                 <w:u w:val="single"/>
               </w:rPr>
-              <w:t>ns</w:t>
+              <w:t>Operatio</w:t>
             </w:r>
             <w:r>
               <w:rPr>
@@ -4297,7 +4388,7 @@
                 <w:szCs w:val="22"/>
                 <w:u w:val="single"/>
               </w:rPr>
-              <w:t xml:space="preserve"> and System Performance</w:t>
+              <w:t>ns</w:t>
             </w:r>
             <w:r>
               <w:rPr>
@@ -4308,6 +4399,17 @@
                 <w:szCs w:val="22"/>
                 <w:u w:val="single"/>
               </w:rPr>
+              <w:t xml:space="preserve"> and System Performance</w:t>
+            </w:r>
+            <w:r>
+              <w:rPr>
+                <w:rFonts w:ascii="Aptos" w:hAnsi="Aptos"/>
+                <w:b/>
+                <w:bCs/>
+                <w:sz w:val="22"/>
+                <w:szCs w:val="22"/>
+                <w:u w:val="single"/>
+              </w:rPr>
               <w:t>:</w:t>
             </w:r>
             <w:r>
@@ -4319,35 +4421,166 @@
               </w:rPr>
               <w:t> </w:t>
             </w:r>
-            <w:bookmarkStart w:id="29" w:name="OLE_LINK2"/>
-            <w:bookmarkStart w:id="30" w:name="OLE_LINK26"/>
-            <w:bookmarkStart w:id="31" w:name="OLE_LINK76"/>
-            <w:bookmarkStart w:id="32" w:name="OLE_LINK24"/>
-            <w:bookmarkStart w:id="33" w:name="OLE_LINK36"/>
-          </w:p>
-          <w:p>
-            <w:pPr>
-              <w:pStyle w:val="NormalWeb"/>
-              <w:shd w:val="clear" w:color="auto" w:fill="FFFFFF"/>
-              <w:spacing w:before="0" w:beforeAutospacing="0" w:after="0" w:afterAutospacing="0"/>
-              <w:rPr>
-                <w:rFonts w:ascii="Aptos" w:hAnsi="Aptos" w:cs="Segoe UI"/>
-                <w:color w:val="000000" w:themeColor="text1"/>
-                <w:sz w:val="22"/>
-                <w:szCs w:val="22"/>
-                <w:shd w:val="clear" w:color="auto" w:fill="FFFFFF"/>
-              </w:rPr>
-            </w:pPr>
-            <w:bookmarkStart w:id="34" w:name="OLE_LINK15"/>
+            <w:bookmarkStart w:id="29" w:name="OLE_LINK15"/>
             <w:bookmarkEnd w:id="5"/>
             <w:bookmarkEnd w:id="10"/>
             <w:bookmarkEnd w:id="11"/>
             <w:bookmarkEnd w:id="22"/>
+          </w:p>
+          <w:p>
+            <w:pPr>
+              <w:pStyle w:val="NormalWeb"/>
+              <w:spacing w:after="240" w:afterAutospacing="0"/>
+              <w:rPr>
+                <w:rFonts w:ascii="Aptos" w:hAnsi="Aptos" w:cs="Segoe UI"/>
+                <w:color w:val="000000" w:themeColor="text1"/>
+                <w:sz w:val="22"/>
+                <w:szCs w:val="22"/>
+                <w:shd w:val="clear" w:color="auto" w:fill="FFFFFF"/>
+              </w:rPr>
+            </w:pPr>
+            <w:bookmarkStart w:id="30" w:name="OLE_LINK22"/>
+            <w:bookmarkStart w:id="31" w:name="OLE_LINK20"/>
+            <w:r>
+              <w:rPr>
+                <w:rFonts w:ascii="Aptos" w:hAnsi="Aptos" w:cs="Segoe UI"/>
+                <w:color w:val="000000" w:themeColor="text1"/>
+                <w:sz w:val="22"/>
+                <w:szCs w:val="22"/>
+                <w:u w:val="single"/>
+                <w:shd w:val="clear" w:color="auto" w:fill="FFFFFF"/>
+              </w:rPr>
+              <w:t>HPCDATAMGM-2188</w:t>
+            </w:r>
+            <w:r>
+              <w:rPr>
+                <w:rFonts w:ascii="Aptos" w:hAnsi="Aptos" w:cs="Segoe UI"/>
+                <w:color w:val="000000" w:themeColor="text1"/>
+                <w:sz w:val="22"/>
+                <w:szCs w:val="22"/>
+                <w:shd w:val="clear" w:color="auto" w:fill="FFFFFF"/>
+              </w:rPr>
+              <w:t xml:space="preserve">: </w:t>
+            </w:r>
+            <w:r>
+              <w:rPr>
+                <w:rFonts w:ascii="Aptos" w:hAnsi="Aptos" w:cs="Segoe UI"/>
+                <w:color w:val="000000" w:themeColor="text1"/>
+                <w:sz w:val="22"/>
+                <w:szCs w:val="22"/>
+                <w:shd w:val="clear" w:color="auto" w:fill="FFFFFF"/>
+              </w:rPr>
+              <w:t xml:space="preserve"> Doubled the JVM memory on the DME primary server to enable export of large results sets (&gt; than 100,000). </w:t>
+            </w:r>
+            <w:bookmarkEnd w:id="1"/>
+            <w:bookmarkEnd w:id="6"/>
+            <w:bookmarkEnd w:id="23"/>
             <w:bookmarkEnd w:id="29"/>
             <w:bookmarkEnd w:id="30"/>
             <w:bookmarkEnd w:id="31"/>
-            <w:bookmarkEnd w:id="32"/>
-            <w:bookmarkEnd w:id="33"/>
+          </w:p>
+          <w:p>
+            <w:pPr>
+              <w:pStyle w:val="NormalWeb"/>
+              <w:shd w:val="clear" w:color="auto" w:fill="FFFFFF"/>
+              <w:spacing w:before="0" w:beforeAutospacing="0" w:after="120" w:afterAutospacing="0"/>
+              <w:rPr>
+                <w:rFonts w:ascii="Aptos" w:hAnsi="Aptos" w:cs="Segoe UI"/>
+                <w:color w:val="000000" w:themeColor="text1"/>
+                <w:shd w:val="clear" w:color="auto" w:fill="FFFFFF"/>
+              </w:rPr>
+            </w:pPr>
+            <w:r>
+              <w:rPr>
+                <w:rFonts w:ascii="Aptos" w:hAnsi="Aptos" w:cs="Segoe UI"/>
+                <w:color w:val="000000" w:themeColor="text1"/>
+                <w:u w:val="single"/>
+                <w:shd w:val="clear" w:color="auto" w:fill="FFFFFF"/>
+              </w:rPr>
+              <w:t>HPCDATAMGM-21</w:t>
+            </w:r>
+            <w:r>
+              <w:rPr>
+                <w:rFonts w:ascii="Aptos" w:hAnsi="Aptos" w:cs="Segoe UI"/>
+                <w:color w:val="000000" w:themeColor="text1"/>
+                <w:u w:val="single"/>
+                <w:shd w:val="clear" w:color="auto" w:fill="FFFFFF"/>
+              </w:rPr>
+              <w:t>50</w:t>
+            </w:r>
+            <w:r>
+              <w:rPr>
+                <w:rFonts w:ascii="Aptos" w:hAnsi="Aptos" w:cs="Segoe UI"/>
+                <w:color w:val="000000" w:themeColor="text1"/>
+                <w:u w:val="single"/>
+                <w:shd w:val="clear" w:color="auto" w:fill="FFFFFF"/>
+              </w:rPr>
+              <w:t>, 2190</w:t>
+            </w:r>
+            <w:r>
+              <w:rPr>
+                <w:rFonts w:ascii="Aptos" w:hAnsi="Aptos" w:cs="Segoe UI"/>
+                <w:color w:val="000000" w:themeColor="text1"/>
+                <w:shd w:val="clear" w:color="auto" w:fill="FFFFFF"/>
+              </w:rPr>
+              <w:t xml:space="preserve">: </w:t>
+            </w:r>
+            <w:r>
+              <w:rPr>
+                <w:rFonts w:ascii="Aptos" w:hAnsi="Aptos" w:cs="Segoe UI"/>
+                <w:color w:val="000000" w:themeColor="text1"/>
+                <w:shd w:val="clear" w:color="auto" w:fill="FFFFFF"/>
+              </w:rPr>
+              <w:t xml:space="preserve">Upgraded the Spring framework </w:t>
+            </w:r>
+            <w:r>
+              <w:rPr>
+                <w:rFonts w:ascii="Aptos" w:hAnsi="Aptos" w:cs="Segoe UI"/>
+                <w:color w:val="000000" w:themeColor="text1"/>
+                <w:shd w:val="clear" w:color="auto" w:fill="FFFFFF"/>
+              </w:rPr>
+              <w:t xml:space="preserve">libraries </w:t>
+            </w:r>
+            <w:r>
+              <w:rPr>
+                <w:rFonts w:ascii="Aptos" w:hAnsi="Aptos" w:cs="Segoe UI"/>
+                <w:color w:val="000000" w:themeColor="text1"/>
+                <w:shd w:val="clear" w:color="auto" w:fill="FFFFFF"/>
+              </w:rPr>
+              <w:t>in the DME API server to r</w:t>
+            </w:r>
+            <w:r>
+              <w:rPr>
+                <w:rFonts w:ascii="Aptos" w:hAnsi="Aptos" w:cs="Segoe UI"/>
+                <w:color w:val="000000" w:themeColor="text1"/>
+                <w:shd w:val="clear" w:color="auto" w:fill="FFFFFF"/>
+              </w:rPr>
+              <w:t>emediate security vulnerabilit</w:t>
+            </w:r>
+            <w:r>
+              <w:rPr>
+                <w:rFonts w:ascii="Aptos" w:hAnsi="Aptos" w:cs="Segoe UI"/>
+                <w:color w:val="000000" w:themeColor="text1"/>
+                <w:shd w:val="clear" w:color="auto" w:fill="FFFFFF"/>
+              </w:rPr>
+              <w:t>ies</w:t>
+            </w:r>
+            <w:r>
+              <w:rPr>
+                <w:rFonts w:ascii="Aptos" w:hAnsi="Aptos" w:cs="Segoe UI"/>
+                <w:color w:val="000000" w:themeColor="text1"/>
+                <w:shd w:val="clear" w:color="auto" w:fill="FFFFFF"/>
+              </w:rPr>
+              <w:t xml:space="preserve"> flagged by the Nessus scan</w:t>
+            </w:r>
+            <w:r>
+              <w:rPr>
+                <w:rFonts w:ascii="Aptos" w:hAnsi="Aptos" w:cs="Segoe UI"/>
+                <w:color w:val="000000" w:themeColor="text1"/>
+                <w:shd w:val="clear" w:color="auto" w:fill="FFFFFF"/>
+              </w:rPr>
+              <w:t>.</w:t>
+            </w:r>
           </w:p>
           <w:p>
             <w:pPr>
@@ -4360,47 +4593,6 @@
                 <w:szCs w:val="22"/>
               </w:rPr>
             </w:pPr>
-            <w:bookmarkStart w:id="35" w:name="OLE_LINK22"/>
-            <w:bookmarkStart w:id="36" w:name="OLE_LINK20"/>
-            <w:r>
-              <w:rPr>
-                <w:rFonts w:ascii="Aptos" w:hAnsi="Aptos" w:cs="Segoe UI"/>
-                <w:color w:val="000000" w:themeColor="text1"/>
-                <w:sz w:val="22"/>
-                <w:szCs w:val="22"/>
-                <w:u w:val="single"/>
-                <w:shd w:val="clear" w:color="auto" w:fill="FFFFFF"/>
-              </w:rPr>
-              <w:t>HPCDATAMGM-2188</w:t>
-            </w:r>
-            <w:r>
-              <w:rPr>
-                <w:rFonts w:ascii="Aptos" w:hAnsi="Aptos" w:cs="Segoe UI"/>
-                <w:color w:val="000000" w:themeColor="text1"/>
-                <w:sz w:val="22"/>
-                <w:szCs w:val="22"/>
-                <w:shd w:val="clear" w:color="auto" w:fill="FFFFFF"/>
-              </w:rPr>
-              <w:t xml:space="preserve">: Fixed the issue of large search exports failing due to insufficient JVM memory in the DME primary server. </w:t>
-            </w:r>
-            <w:bookmarkEnd w:id="1"/>
-            <w:bookmarkEnd w:id="6"/>
-            <w:bookmarkEnd w:id="23"/>
-            <w:bookmarkEnd w:id="34"/>
-            <w:bookmarkEnd w:id="35"/>
-            <w:bookmarkEnd w:id="36"/>
-          </w:p>
-          <w:p>
-            <w:pPr>
-              <w:pStyle w:val="NormalWeb"/>
-              <w:spacing w:after="240" w:afterAutospacing="0"/>
-              <w:rPr>
-                <w:rFonts w:ascii="Aptos" w:hAnsi="Aptos" w:cs="Segoe UI"/>
-                <w:color w:val="000000" w:themeColor="text1"/>
-                <w:sz w:val="22"/>
-                <w:szCs w:val="22"/>
-              </w:rPr>
-            </w:pPr>
           </w:p>
           <w:bookmarkEnd w:id="7"/>
           <w:p>
@@ -4430,7 +4622,7 @@
                 <w:szCs w:val="22"/>
               </w:rPr>
             </w:pPr>
-            <w:bookmarkStart w:id="37" w:name="OLE_LINK5"/>
+            <w:bookmarkStart w:id="32" w:name="OLE_LINK5"/>
           </w:p>
           <w:p>
             <w:pPr>
@@ -4806,7 +4998,7 @@
             <w:bookmarkEnd w:id="3"/>
             <w:bookmarkEnd w:id="8"/>
             <w:bookmarkEnd w:id="9"/>
-            <w:bookmarkEnd w:id="37"/>
+            <w:bookmarkEnd w:id="32"/>
           </w:p>
           <w:p>
             <w:pPr>
@@ -5131,7 +5323,6 @@
                 <w:sz w:val="22"/>
                 <w:szCs w:val="22"/>
               </w:rPr>
-              <w:lastRenderedPageBreak/>
               <w:t xml:space="preserve">You can access </w:t>
             </w:r>
             <w:r>

</xml_diff>

<commit_message>
Updated with additional information
</commit_message>
<xml_diff>
--- a/doc/release/HPC DME Release Notes 3.26.0.docx
+++ b/doc/release/HPC DME Release Notes 3.26.0.docx
@@ -3898,70 +3898,196 @@
               <w:textAlignment w:val="baseline"/>
               <w:rPr>
                 <w:rFonts w:ascii="Aptos" w:hAnsi="Aptos" w:cstheme="minorHAnsi"/>
-                <w:sz w:val="22"/>
-                <w:szCs w:val="22"/>
-              </w:rPr>
-            </w:pPr>
-            <w:bookmarkStart w:id="24" w:name="OLE_LINK143"/>
-            <w:r>
-              <w:rPr>
-                <w:rFonts w:ascii="Aptos" w:hAnsi="Aptos" w:cstheme="minorHAnsi"/>
+                <w:color w:val="000000" w:themeColor="text1"/>
+                <w:sz w:val="22"/>
+                <w:szCs w:val="22"/>
+              </w:rPr>
+            </w:pPr>
+            <w:bookmarkStart w:id="24" w:name="OLE_LINK32"/>
+            <w:r>
+              <w:rPr>
+                <w:rFonts w:ascii="Aptos" w:hAnsi="Aptos" w:cstheme="minorHAnsi"/>
+                <w:color w:val="000000" w:themeColor="text1"/>
                 <w:sz w:val="22"/>
                 <w:szCs w:val="22"/>
                 <w:u w:val="single"/>
               </w:rPr>
-              <w:t>HPCDATAMGM-21</w:t>
-            </w:r>
-            <w:r>
-              <w:rPr>
-                <w:rFonts w:ascii="Aptos" w:hAnsi="Aptos" w:cstheme="minorHAnsi"/>
+              <w:t xml:space="preserve">HPCDATAMGM-1548: </w:t>
+            </w:r>
+            <w:r>
+              <w:rPr>
+                <w:rFonts w:ascii="Aptos" w:hAnsi="Aptos" w:cstheme="minorHAnsi"/>
+                <w:color w:val="000000" w:themeColor="text1"/>
+                <w:sz w:val="22"/>
+                <w:szCs w:val="22"/>
+              </w:rPr>
+              <w:t>Enhance</w:t>
+            </w:r>
+            <w:r>
+              <w:rPr>
+                <w:rFonts w:ascii="Aptos" w:hAnsi="Aptos" w:cstheme="minorHAnsi"/>
+                <w:color w:val="000000" w:themeColor="text1"/>
+                <w:sz w:val="22"/>
+                <w:szCs w:val="22"/>
+              </w:rPr>
+              <w:t>d</w:t>
+            </w:r>
+            <w:r>
+              <w:rPr>
+                <w:rFonts w:ascii="Aptos" w:hAnsi="Aptos" w:cstheme="minorHAnsi"/>
+                <w:color w:val="000000" w:themeColor="text1"/>
+                <w:sz w:val="22"/>
+                <w:szCs w:val="22"/>
+              </w:rPr>
+              <w:t xml:space="preserve"> the DME web application to display the sizes of the collections listed in the file table of the Browse screen.</w:t>
+            </w:r>
+            <w:bookmarkStart w:id="25" w:name="OLE_LINK14"/>
+            <w:bookmarkEnd w:id="19"/>
+          </w:p>
+          <w:p>
+            <w:pPr>
+              <w:pStyle w:val="NormalWeb"/>
+              <w:spacing w:after="240" w:afterAutospacing="0"/>
+              <w:rPr>
+                <w:rFonts w:ascii="Aptos" w:hAnsi="Aptos" w:cs="Segoe UI"/>
+                <w:color w:val="172B4D"/>
+                <w:sz w:val="22"/>
+                <w:szCs w:val="22"/>
+                <w:shd w:val="clear" w:color="auto" w:fill="FFFFFF"/>
+              </w:rPr>
+            </w:pPr>
+            <w:bookmarkStart w:id="26" w:name="OLE_LINK30"/>
+            <w:r>
+              <w:rPr>
+                <w:rFonts w:ascii="Aptos" w:hAnsi="Aptos" w:cs="Segoe UI"/>
+                <w:color w:val="000000" w:themeColor="text1"/>
                 <w:sz w:val="22"/>
                 <w:szCs w:val="22"/>
                 <w:u w:val="single"/>
               </w:rPr>
-              <w:t>87</w:t>
-            </w:r>
-            <w:r>
-              <w:rPr>
-                <w:rFonts w:ascii="Aptos" w:hAnsi="Aptos" w:cstheme="minorHAnsi"/>
-                <w:sz w:val="22"/>
-                <w:szCs w:val="22"/>
-              </w:rPr>
-              <w:t xml:space="preserve">: </w:t>
-            </w:r>
-            <w:r>
-              <w:rPr>
-                <w:rFonts w:ascii="Aptos" w:hAnsi="Aptos" w:cstheme="minorHAnsi"/>
-                <w:sz w:val="22"/>
-                <w:szCs w:val="22"/>
-              </w:rPr>
-              <w:t>Enhance</w:t>
-            </w:r>
-            <w:r>
-              <w:rPr>
-                <w:rFonts w:ascii="Aptos" w:hAnsi="Aptos" w:cstheme="minorHAnsi"/>
-                <w:sz w:val="22"/>
-                <w:szCs w:val="22"/>
-              </w:rPr>
-              <w:t>d</w:t>
-            </w:r>
-            <w:r>
-              <w:rPr>
-                <w:rFonts w:ascii="Aptos" w:hAnsi="Aptos" w:cstheme="minorHAnsi"/>
-                <w:sz w:val="22"/>
-                <w:szCs w:val="22"/>
-              </w:rPr>
-              <w:t xml:space="preserve"> the DME web application to display the download size in the Download Tasks </w:t>
-            </w:r>
-            <w:r>
-              <w:rPr>
-                <w:rFonts w:ascii="Aptos" w:hAnsi="Aptos" w:cstheme="minorHAnsi"/>
-                <w:sz w:val="22"/>
-                <w:szCs w:val="22"/>
-              </w:rPr>
-              <w:t xml:space="preserve">Details page. </w:t>
-            </w:r>
-            <w:bookmarkEnd w:id="24"/>
+              <w:t>DMESUPPORT</w:t>
+            </w:r>
+            <w:r>
+              <w:rPr>
+                <w:rFonts w:ascii="Aptos" w:hAnsi="Aptos" w:cs="Segoe UI"/>
+                <w:color w:val="000000" w:themeColor="text1"/>
+                <w:sz w:val="22"/>
+                <w:szCs w:val="22"/>
+                <w:u w:val="single"/>
+              </w:rPr>
+              <w:t>-</w:t>
+            </w:r>
+            <w:r>
+              <w:rPr>
+                <w:rFonts w:ascii="Aptos" w:hAnsi="Aptos" w:cs="Segoe UI"/>
+                <w:color w:val="000000" w:themeColor="text1"/>
+                <w:sz w:val="22"/>
+                <w:szCs w:val="22"/>
+                <w:u w:val="single"/>
+              </w:rPr>
+              <w:t>203</w:t>
+            </w:r>
+            <w:r>
+              <w:rPr>
+                <w:rFonts w:ascii="Aptos" w:hAnsi="Aptos" w:cs="Segoe UI"/>
+                <w:color w:val="000000" w:themeColor="text1"/>
+                <w:sz w:val="22"/>
+                <w:szCs w:val="22"/>
+                <w:u w:val="single"/>
+              </w:rPr>
+              <w:t>:</w:t>
+            </w:r>
+            <w:r>
+              <w:rPr>
+                <w:rFonts w:ascii="Aptos" w:hAnsi="Aptos" w:cs="Segoe UI"/>
+                <w:color w:val="000000" w:themeColor="text1"/>
+                <w:sz w:val="22"/>
+                <w:szCs w:val="22"/>
+              </w:rPr>
+              <w:t xml:space="preserve">  </w:t>
+            </w:r>
+            <w:bookmarkStart w:id="27" w:name="OLE_LINK31"/>
+            <w:bookmarkStart w:id="28" w:name="OLE_LINK17"/>
+            <w:r>
+              <w:rPr>
+                <w:rFonts w:ascii="Aptos" w:hAnsi="Aptos" w:cs="Segoe UI"/>
+                <w:color w:val="000000" w:themeColor="text1"/>
+                <w:sz w:val="22"/>
+                <w:szCs w:val="22"/>
+              </w:rPr>
+              <w:t xml:space="preserve">Enhanced the DME archival workflow framework to include a new </w:t>
+            </w:r>
+            <w:r>
+              <w:rPr>
+                <w:rFonts w:ascii="Aptos" w:hAnsi="Aptos" w:cs="Segoe UI"/>
+                <w:color w:val="172B4D"/>
+                <w:sz w:val="22"/>
+                <w:szCs w:val="22"/>
+                <w:shd w:val="clear" w:color="auto" w:fill="FFFFFF"/>
+              </w:rPr>
+              <w:t>‘</w:t>
+            </w:r>
+            <w:r>
+              <w:rPr>
+                <w:rStyle w:val="HTMLTypewriter"/>
+                <w:rFonts w:ascii="Aptos" w:hAnsi="Aptos"/>
+                <w:color w:val="172B4D"/>
+                <w:sz w:val="22"/>
+                <w:szCs w:val="22"/>
+                <w:shd w:val="clear" w:color="auto" w:fill="FFFFFF"/>
+              </w:rPr>
+              <w:t>reattempts’</w:t>
+            </w:r>
+            <w:r>
+              <w:rPr>
+                <w:rFonts w:ascii="Aptos" w:hAnsi="Aptos" w:cs="Segoe UI"/>
+                <w:sz w:val="22"/>
+                <w:szCs w:val="22"/>
+              </w:rPr>
+              <w:t xml:space="preserve"> column</w:t>
+            </w:r>
+            <w:r>
+              <w:rPr>
+                <w:rFonts w:ascii="Aptos" w:hAnsi="Aptos" w:cs="Segoe UI"/>
+                <w:color w:val="172B4D"/>
+                <w:sz w:val="22"/>
+                <w:szCs w:val="22"/>
+                <w:shd w:val="clear" w:color="auto" w:fill="FFFFFF"/>
+              </w:rPr>
+              <w:t xml:space="preserve"> in the automated report </w:t>
+            </w:r>
+            <w:r>
+              <w:rPr>
+                <w:rFonts w:ascii="Aptos" w:hAnsi="Aptos" w:cs="Segoe UI"/>
+                <w:color w:val="172B4D"/>
+                <w:sz w:val="22"/>
+                <w:szCs w:val="22"/>
+                <w:shd w:val="clear" w:color="auto" w:fill="FFFFFF"/>
+              </w:rPr>
+              <w:t xml:space="preserve">mailed to users </w:t>
+            </w:r>
+            <w:r>
+              <w:rPr>
+                <w:rFonts w:ascii="Aptos" w:hAnsi="Aptos" w:cs="Segoe UI"/>
+                <w:color w:val="172B4D"/>
+                <w:sz w:val="22"/>
+                <w:szCs w:val="22"/>
+                <w:shd w:val="clear" w:color="auto" w:fill="FFFFFF"/>
+              </w:rPr>
+              <w:t xml:space="preserve">to track the number of retry attempts for the file across the runs. </w:t>
+            </w:r>
+            <w:bookmarkEnd w:id="13"/>
+            <w:bookmarkEnd w:id="14"/>
+            <w:bookmarkEnd w:id="15"/>
+            <w:bookmarkEnd w:id="16"/>
+            <w:bookmarkEnd w:id="17"/>
+            <w:bookmarkEnd w:id="18"/>
+            <w:bookmarkEnd w:id="20"/>
+            <w:bookmarkEnd w:id="21"/>
+            <w:bookmarkEnd w:id="25"/>
+            <w:bookmarkEnd w:id="26"/>
+            <w:bookmarkEnd w:id="27"/>
+            <w:bookmarkEnd w:id="28"/>
           </w:p>
           <w:p>
             <w:pPr>
@@ -3977,276 +4103,39 @@
             <w:r>
               <w:rPr>
                 <w:rFonts w:ascii="Aptos" w:hAnsi="Aptos" w:cstheme="minorHAnsi"/>
-                <w:color w:val="000000" w:themeColor="text1"/>
                 <w:sz w:val="22"/>
                 <w:szCs w:val="22"/>
                 <w:u w:val="single"/>
               </w:rPr>
-              <w:t xml:space="preserve">HPCDATAMGM-1548: </w:t>
-            </w:r>
-            <w:r>
-              <w:rPr>
-                <w:rFonts w:ascii="Aptos" w:hAnsi="Aptos" w:cstheme="minorHAnsi"/>
-                <w:color w:val="000000" w:themeColor="text1"/>
-                <w:sz w:val="22"/>
-                <w:szCs w:val="22"/>
-              </w:rPr>
-              <w:t>Enhance</w:t>
-            </w:r>
-            <w:r>
-              <w:rPr>
-                <w:rFonts w:ascii="Aptos" w:hAnsi="Aptos" w:cstheme="minorHAnsi"/>
-                <w:color w:val="000000" w:themeColor="text1"/>
-                <w:sz w:val="22"/>
-                <w:szCs w:val="22"/>
-              </w:rPr>
-              <w:t>d</w:t>
-            </w:r>
-            <w:r>
-              <w:rPr>
-                <w:rFonts w:ascii="Aptos" w:hAnsi="Aptos" w:cstheme="minorHAnsi"/>
-                <w:color w:val="000000" w:themeColor="text1"/>
-                <w:sz w:val="22"/>
-                <w:szCs w:val="22"/>
-              </w:rPr>
-              <w:t xml:space="preserve"> the DME web application to display the sizes of the collections listed in the file table of the Browse screen.</w:t>
-            </w:r>
-            <w:bookmarkStart w:id="25" w:name="OLE_LINK14"/>
-            <w:bookmarkEnd w:id="19"/>
-          </w:p>
-          <w:p>
-            <w:pPr>
-              <w:pStyle w:val="Heading2"/>
-              <w:rPr>
-                <w:rFonts w:ascii="Aptos" w:hAnsi="Aptos" w:cstheme="minorHAnsi"/>
-                <w:color w:val="000000" w:themeColor="text1"/>
-                <w:sz w:val="22"/>
-                <w:szCs w:val="22"/>
-              </w:rPr>
-            </w:pPr>
-            <w:r>
-              <w:rPr>
-                <w:rFonts w:ascii="Aptos" w:eastAsiaTheme="minorHAnsi" w:hAnsi="Aptos" w:cs="AppleSystemUIFont"/>
-                <w:color w:val="000000" w:themeColor="text1"/>
+              <w:t>HPCDATAMGM-2187</w:t>
+            </w:r>
+            <w:r>
+              <w:rPr>
+                <w:rFonts w:ascii="Aptos" w:hAnsi="Aptos" w:cstheme="minorHAnsi"/>
+                <w:sz w:val="22"/>
+                <w:szCs w:val="22"/>
+              </w:rPr>
+              <w:t xml:space="preserve">: Enhanced the DME web application to display the download size in the Download Tasks Details page. </w:t>
+            </w:r>
+          </w:p>
+          <w:p>
+            <w:pPr>
+              <w:rPr>
+                <w:rFonts w:ascii="Aptos" w:hAnsi="Aptos"/>
+                <w:sz w:val="22"/>
+                <w:szCs w:val="22"/>
+              </w:rPr>
+            </w:pPr>
+            <w:r>
+              <w:rPr>
+                <w:rFonts w:ascii="Aptos" w:hAnsi="Aptos"/>
                 <w:sz w:val="22"/>
                 <w:szCs w:val="22"/>
                 <w:u w:val="single"/>
               </w:rPr>
-              <w:t>DMESUPPORT-1</w:t>
-            </w:r>
-            <w:r>
-              <w:rPr>
-                <w:rFonts w:ascii="Aptos" w:eastAsiaTheme="minorHAnsi" w:hAnsi="Aptos" w:cs="AppleSystemUIFont"/>
-                <w:color w:val="000000" w:themeColor="text1"/>
-                <w:sz w:val="22"/>
-                <w:szCs w:val="22"/>
-                <w:u w:val="single"/>
-              </w:rPr>
-              <w:t>7</w:t>
-            </w:r>
-            <w:r>
-              <w:rPr>
-                <w:rFonts w:ascii="Aptos" w:eastAsiaTheme="minorHAnsi" w:hAnsi="Aptos" w:cs="AppleSystemUIFont"/>
-                <w:color w:val="000000" w:themeColor="text1"/>
-                <w:sz w:val="22"/>
-                <w:szCs w:val="22"/>
-                <w:u w:val="single"/>
-              </w:rPr>
-              <w:t>4</w:t>
-            </w:r>
-            <w:r>
-              <w:rPr>
-                <w:rFonts w:ascii="Aptos" w:eastAsiaTheme="minorHAnsi" w:hAnsi="Aptos" w:cs="AppleSystemUIFont"/>
-                <w:color w:val="000000" w:themeColor="text1"/>
-                <w:sz w:val="22"/>
-                <w:szCs w:val="22"/>
-              </w:rPr>
-              <w:t xml:space="preserve">: </w:t>
-            </w:r>
-            <w:r>
-              <w:rPr>
-                <w:rFonts w:ascii="Aptos" w:hAnsi="Aptos"/>
-                <w:color w:val="000000" w:themeColor="text1"/>
-                <w:sz w:val="22"/>
-                <w:szCs w:val="22"/>
-              </w:rPr>
-              <w:t>Enhance</w:t>
-            </w:r>
-            <w:r>
-              <w:rPr>
-                <w:rFonts w:ascii="Aptos" w:hAnsi="Aptos"/>
-                <w:color w:val="000000" w:themeColor="text1"/>
-                <w:sz w:val="22"/>
-                <w:szCs w:val="22"/>
-              </w:rPr>
-              <w:t>d</w:t>
-            </w:r>
-            <w:r>
-              <w:rPr>
-                <w:rFonts w:ascii="Aptos" w:hAnsi="Aptos"/>
-                <w:color w:val="000000" w:themeColor="text1"/>
-                <w:sz w:val="22"/>
-                <w:szCs w:val="22"/>
-              </w:rPr>
-              <w:t xml:space="preserve"> the DME archival workflow framework to </w:t>
-            </w:r>
-            <w:r>
-              <w:rPr>
-                <w:rFonts w:ascii="Aptos" w:hAnsi="Aptos"/>
-                <w:color w:val="000000" w:themeColor="text1"/>
-                <w:sz w:val="22"/>
-                <w:szCs w:val="22"/>
-              </w:rPr>
-              <w:t xml:space="preserve">identify and eliminate duplicate symbolic links during tarring for archival. </w:t>
-            </w:r>
-          </w:p>
-          <w:p>
-            <w:pPr>
-              <w:pStyle w:val="NormalWeb"/>
-              <w:spacing w:after="240" w:afterAutospacing="0"/>
-              <w:rPr>
-                <w:rFonts w:ascii="Aptos" w:hAnsi="Aptos" w:cs="Segoe UI"/>
-                <w:color w:val="172B4D"/>
-                <w:sz w:val="22"/>
-                <w:szCs w:val="22"/>
-                <w:shd w:val="clear" w:color="auto" w:fill="FFFFFF"/>
-              </w:rPr>
-            </w:pPr>
-            <w:bookmarkStart w:id="26" w:name="OLE_LINK30"/>
-            <w:r>
-              <w:rPr>
-                <w:rFonts w:ascii="Aptos" w:hAnsi="Aptos" w:cs="Segoe UI"/>
-                <w:color w:val="000000" w:themeColor="text1"/>
-                <w:sz w:val="22"/>
-                <w:szCs w:val="22"/>
-                <w:u w:val="single"/>
-              </w:rPr>
-              <w:t>DMESUPPORT</w:t>
-            </w:r>
-            <w:r>
-              <w:rPr>
-                <w:rFonts w:ascii="Aptos" w:hAnsi="Aptos" w:cs="Segoe UI"/>
-                <w:color w:val="000000" w:themeColor="text1"/>
-                <w:sz w:val="22"/>
-                <w:szCs w:val="22"/>
-                <w:u w:val="single"/>
-              </w:rPr>
-              <w:t>-</w:t>
-            </w:r>
-            <w:r>
-              <w:rPr>
-                <w:rFonts w:ascii="Aptos" w:hAnsi="Aptos" w:cs="Segoe UI"/>
-                <w:color w:val="000000" w:themeColor="text1"/>
-                <w:sz w:val="22"/>
-                <w:szCs w:val="22"/>
-                <w:u w:val="single"/>
-              </w:rPr>
-              <w:t>203</w:t>
-            </w:r>
-            <w:r>
-              <w:rPr>
-                <w:rFonts w:ascii="Aptos" w:hAnsi="Aptos" w:cs="Segoe UI"/>
-                <w:color w:val="000000" w:themeColor="text1"/>
-                <w:sz w:val="22"/>
-                <w:szCs w:val="22"/>
-                <w:u w:val="single"/>
-              </w:rPr>
-              <w:t>:</w:t>
-            </w:r>
-            <w:r>
-              <w:rPr>
-                <w:rFonts w:ascii="Aptos" w:hAnsi="Aptos" w:cs="Segoe UI"/>
-                <w:color w:val="000000" w:themeColor="text1"/>
-                <w:sz w:val="22"/>
-                <w:szCs w:val="22"/>
-              </w:rPr>
-              <w:t xml:space="preserve">  </w:t>
-            </w:r>
-            <w:bookmarkStart w:id="27" w:name="OLE_LINK31"/>
-            <w:bookmarkStart w:id="28" w:name="OLE_LINK17"/>
-            <w:r>
-              <w:rPr>
-                <w:rFonts w:ascii="Aptos" w:hAnsi="Aptos" w:cs="Segoe UI"/>
-                <w:color w:val="000000" w:themeColor="text1"/>
-                <w:sz w:val="22"/>
-                <w:szCs w:val="22"/>
-              </w:rPr>
-              <w:t xml:space="preserve">Enhanced the DME archival workflow framework to include a new </w:t>
-            </w:r>
-            <w:r>
-              <w:rPr>
-                <w:rFonts w:ascii="Aptos" w:hAnsi="Aptos" w:cs="Segoe UI"/>
-                <w:color w:val="172B4D"/>
-                <w:sz w:val="22"/>
-                <w:szCs w:val="22"/>
-                <w:shd w:val="clear" w:color="auto" w:fill="FFFFFF"/>
-              </w:rPr>
-              <w:t>‘</w:t>
-            </w:r>
-            <w:r>
-              <w:rPr>
-                <w:rStyle w:val="HTMLTypewriter"/>
-                <w:rFonts w:ascii="Aptos" w:hAnsi="Aptos"/>
-                <w:color w:val="172B4D"/>
-                <w:sz w:val="22"/>
-                <w:szCs w:val="22"/>
-                <w:shd w:val="clear" w:color="auto" w:fill="FFFFFF"/>
-              </w:rPr>
-              <w:t>reattempts’</w:t>
-            </w:r>
-            <w:r>
-              <w:rPr>
-                <w:rFonts w:ascii="Aptos" w:hAnsi="Aptos" w:cs="Segoe UI"/>
-                <w:sz w:val="22"/>
-                <w:szCs w:val="22"/>
-              </w:rPr>
-              <w:t xml:space="preserve"> column</w:t>
-            </w:r>
-            <w:r>
-              <w:rPr>
-                <w:rFonts w:ascii="Aptos" w:hAnsi="Aptos" w:cs="Segoe UI"/>
-                <w:color w:val="172B4D"/>
-                <w:sz w:val="22"/>
-                <w:szCs w:val="22"/>
-                <w:shd w:val="clear" w:color="auto" w:fill="FFFFFF"/>
-              </w:rPr>
-              <w:t xml:space="preserve"> in the automated report </w:t>
-            </w:r>
-            <w:r>
-              <w:rPr>
-                <w:rFonts w:ascii="Aptos" w:hAnsi="Aptos" w:cs="Segoe UI"/>
-                <w:color w:val="172B4D"/>
-                <w:sz w:val="22"/>
-                <w:szCs w:val="22"/>
-                <w:shd w:val="clear" w:color="auto" w:fill="FFFFFF"/>
-              </w:rPr>
-              <w:t xml:space="preserve">mailed to users </w:t>
-            </w:r>
-            <w:r>
-              <w:rPr>
-                <w:rFonts w:ascii="Aptos" w:hAnsi="Aptos" w:cs="Segoe UI"/>
-                <w:color w:val="172B4D"/>
-                <w:sz w:val="22"/>
-                <w:szCs w:val="22"/>
-                <w:shd w:val="clear" w:color="auto" w:fill="FFFFFF"/>
-              </w:rPr>
-              <w:t xml:space="preserve">to track the number of retry attempts for the file across the runs. </w:t>
-            </w:r>
-            <w:bookmarkEnd w:id="27"/>
-            <w:bookmarkEnd w:id="28"/>
-          </w:p>
-          <w:bookmarkEnd w:id="13"/>
-          <w:bookmarkEnd w:id="14"/>
-          <w:bookmarkEnd w:id="15"/>
-          <w:bookmarkEnd w:id="16"/>
-          <w:bookmarkEnd w:id="17"/>
-          <w:bookmarkEnd w:id="18"/>
-          <w:bookmarkEnd w:id="20"/>
-          <w:bookmarkEnd w:id="21"/>
-          <w:bookmarkEnd w:id="25"/>
-          <w:bookmarkEnd w:id="26"/>
-          <w:p>
-            <w:pPr>
+              <w:t>HPCDATAMGM-2195</w:t>
+            </w:r>
+            <w:r>
               <w:rPr>
                 <w:rFonts w:ascii="Aptos" w:hAnsi="Aptos"/>
                 <w:b/>
@@ -4255,18 +4144,171 @@
                 <w:szCs w:val="22"/>
                 <w:u w:val="single"/>
               </w:rPr>
-            </w:pPr>
-          </w:p>
-          <w:p>
-            <w:pPr>
-              <w:rPr>
-                <w:rFonts w:ascii="Aptos" w:hAnsi="Aptos"/>
-                <w:color w:val="0E101A"/>
-                <w:sz w:val="22"/>
-                <w:szCs w:val="22"/>
-              </w:rPr>
-            </w:pPr>
-            <w:r>
+              <w:t xml:space="preserve">:  </w:t>
+            </w:r>
+            <w:r>
+              <w:rPr>
+                <w:rFonts w:ascii="Aptos" w:hAnsi="Aptos"/>
+                <w:sz w:val="22"/>
+                <w:szCs w:val="22"/>
+              </w:rPr>
+              <w:t xml:space="preserve">Fixed </w:t>
+            </w:r>
+            <w:r>
+              <w:rPr>
+                <w:rFonts w:ascii="Aptos" w:hAnsi="Aptos"/>
+                <w:sz w:val="22"/>
+                <w:szCs w:val="22"/>
+              </w:rPr>
+              <w:t xml:space="preserve">the </w:t>
+            </w:r>
+            <w:r>
+              <w:rPr>
+                <w:rFonts w:ascii="Aptos" w:hAnsi="Aptos"/>
+                <w:sz w:val="22"/>
+                <w:szCs w:val="22"/>
+              </w:rPr>
+              <w:t xml:space="preserve">issue </w:t>
+            </w:r>
+            <w:r>
+              <w:rPr>
+                <w:rFonts w:ascii="Aptos" w:hAnsi="Aptos"/>
+                <w:sz w:val="22"/>
+                <w:szCs w:val="22"/>
+              </w:rPr>
+              <w:t>of</w:t>
+            </w:r>
+            <w:r>
+              <w:rPr>
+                <w:rFonts w:ascii="Aptos" w:hAnsi="Aptos"/>
+                <w:sz w:val="22"/>
+                <w:szCs w:val="22"/>
+              </w:rPr>
+              <w:t xml:space="preserve"> </w:t>
+            </w:r>
+            <w:r>
+              <w:rPr>
+                <w:rFonts w:ascii="Aptos" w:hAnsi="Aptos"/>
+                <w:sz w:val="22"/>
+                <w:szCs w:val="22"/>
+              </w:rPr>
+              <w:t xml:space="preserve">errors occurring </w:t>
+            </w:r>
+            <w:r>
+              <w:rPr>
+                <w:rFonts w:ascii="Aptos" w:hAnsi="Aptos"/>
+                <w:sz w:val="22"/>
+                <w:szCs w:val="22"/>
+              </w:rPr>
+              <w:t xml:space="preserve">intermittently </w:t>
+            </w:r>
+            <w:r>
+              <w:rPr>
+                <w:rFonts w:ascii="Aptos" w:hAnsi="Aptos"/>
+                <w:sz w:val="22"/>
+                <w:szCs w:val="22"/>
+              </w:rPr>
+              <w:t xml:space="preserve">during </w:t>
+            </w:r>
+            <w:r>
+              <w:rPr>
+                <w:rFonts w:ascii="Aptos" w:hAnsi="Aptos"/>
+                <w:sz w:val="22"/>
+                <w:szCs w:val="22"/>
+              </w:rPr>
+              <w:t>Globus transactions due to a change in a Globus error code.</w:t>
+            </w:r>
+          </w:p>
+          <w:p>
+            <w:pPr>
+              <w:rPr>
+                <w:rFonts w:ascii="Aptos" w:hAnsi="Aptos"/>
+                <w:sz w:val="22"/>
+                <w:szCs w:val="22"/>
+                <w:u w:val="single"/>
+              </w:rPr>
+            </w:pPr>
+          </w:p>
+          <w:p>
+            <w:pPr>
+              <w:rPr>
+                <w:rFonts w:ascii="Aptos" w:hAnsi="Aptos"/>
+                <w:sz w:val="22"/>
+                <w:szCs w:val="22"/>
+              </w:rPr>
+            </w:pPr>
+            <w:r>
+              <w:rPr>
+                <w:rFonts w:ascii="Aptos" w:hAnsi="Aptos"/>
+                <w:sz w:val="22"/>
+                <w:szCs w:val="22"/>
+                <w:u w:val="single"/>
+              </w:rPr>
+              <w:t xml:space="preserve">HPCDATAMGM-2192: </w:t>
+            </w:r>
+            <w:r>
+              <w:rPr>
+                <w:rFonts w:ascii="Aptos" w:hAnsi="Aptos"/>
+                <w:sz w:val="22"/>
+                <w:szCs w:val="22"/>
+                <w:u w:val="single"/>
+              </w:rPr>
+              <w:t xml:space="preserve"> </w:t>
+            </w:r>
+            <w:r>
+              <w:rPr>
+                <w:rFonts w:ascii="Aptos" w:hAnsi="Aptos"/>
+                <w:sz w:val="22"/>
+                <w:szCs w:val="22"/>
+              </w:rPr>
+              <w:t xml:space="preserve">Fixed issue with adding permissions </w:t>
+            </w:r>
+            <w:r>
+              <w:rPr>
+                <w:rFonts w:ascii="Aptos" w:hAnsi="Aptos"/>
+                <w:sz w:val="22"/>
+                <w:szCs w:val="22"/>
+              </w:rPr>
+              <w:t xml:space="preserve">for more than 21 users </w:t>
+            </w:r>
+            <w:r>
+              <w:rPr>
+                <w:rFonts w:ascii="Aptos" w:hAnsi="Aptos"/>
+                <w:sz w:val="22"/>
+                <w:szCs w:val="22"/>
+              </w:rPr>
+              <w:t xml:space="preserve">to a </w:t>
+            </w:r>
+            <w:r>
+              <w:rPr>
+                <w:rFonts w:ascii="Aptos" w:hAnsi="Aptos"/>
+                <w:sz w:val="22"/>
+                <w:szCs w:val="22"/>
+              </w:rPr>
+              <w:t xml:space="preserve">file or </w:t>
+            </w:r>
+            <w:r>
+              <w:rPr>
+                <w:rFonts w:ascii="Aptos" w:hAnsi="Aptos"/>
+                <w:sz w:val="22"/>
+                <w:szCs w:val="22"/>
+              </w:rPr>
+              <w:t>collection in the DME web application.</w:t>
+            </w:r>
+          </w:p>
+          <w:bookmarkEnd w:id="24"/>
+          <w:p>
+            <w:pPr>
+              <w:rPr>
+                <w:rFonts w:ascii="Aptos" w:hAnsi="Aptos"/>
+                <w:sz w:val="22"/>
+                <w:szCs w:val="22"/>
+                <w:u w:val="single"/>
+              </w:rPr>
+            </w:pPr>
+          </w:p>
+          <w:p>
+            <w:pPr>
               <w:rPr>
                 <w:rFonts w:ascii="Aptos" w:hAnsi="Aptos"/>
                 <w:b/>
@@ -4275,8 +4317,17 @@
                 <w:szCs w:val="22"/>
                 <w:u w:val="single"/>
               </w:rPr>
-              <w:t>Operatio</w:t>
-            </w:r>
+            </w:pPr>
+          </w:p>
+          <w:p>
+            <w:pPr>
+              <w:rPr>
+                <w:rFonts w:ascii="Aptos" w:hAnsi="Aptos"/>
+                <w:color w:val="0E101A"/>
+                <w:sz w:val="22"/>
+                <w:szCs w:val="22"/>
+              </w:rPr>
+            </w:pPr>
             <w:r>
               <w:rPr>
                 <w:rFonts w:ascii="Aptos" w:hAnsi="Aptos"/>
@@ -4286,7 +4337,7 @@
                 <w:szCs w:val="22"/>
                 <w:u w:val="single"/>
               </w:rPr>
-              <w:t>ns</w:t>
+              <w:t>Operatio</w:t>
             </w:r>
             <w:r>
               <w:rPr>
@@ -4297,7 +4348,7 @@
                 <w:szCs w:val="22"/>
                 <w:u w:val="single"/>
               </w:rPr>
-              <w:t xml:space="preserve"> and System Performance</w:t>
+              <w:t>ns</w:t>
             </w:r>
             <w:r>
               <w:rPr>
@@ -4308,6 +4359,17 @@
                 <w:szCs w:val="22"/>
                 <w:u w:val="single"/>
               </w:rPr>
+              <w:t xml:space="preserve"> and System Performance</w:t>
+            </w:r>
+            <w:r>
+              <w:rPr>
+                <w:rFonts w:ascii="Aptos" w:hAnsi="Aptos"/>
+                <w:b/>
+                <w:bCs/>
+                <w:sz w:val="22"/>
+                <w:szCs w:val="22"/>
+                <w:u w:val="single"/>
+              </w:rPr>
               <w:t>:</w:t>
             </w:r>
             <w:r>
@@ -4319,36 +4381,152 @@
               </w:rPr>
               <w:t> </w:t>
             </w:r>
-            <w:bookmarkStart w:id="29" w:name="OLE_LINK2"/>
-            <w:bookmarkStart w:id="30" w:name="OLE_LINK26"/>
-            <w:bookmarkStart w:id="31" w:name="OLE_LINK76"/>
-            <w:bookmarkStart w:id="32" w:name="OLE_LINK24"/>
-            <w:bookmarkStart w:id="33" w:name="OLE_LINK36"/>
-          </w:p>
-          <w:p>
-            <w:pPr>
-              <w:pStyle w:val="NormalWeb"/>
-              <w:shd w:val="clear" w:color="auto" w:fill="FFFFFF"/>
-              <w:spacing w:before="0" w:beforeAutospacing="0" w:after="0" w:afterAutospacing="0"/>
-              <w:rPr>
-                <w:rFonts w:ascii="Aptos" w:hAnsi="Aptos" w:cs="Segoe UI"/>
-                <w:color w:val="000000" w:themeColor="text1"/>
-                <w:sz w:val="22"/>
-                <w:szCs w:val="22"/>
-                <w:shd w:val="clear" w:color="auto" w:fill="FFFFFF"/>
-              </w:rPr>
-            </w:pPr>
-            <w:bookmarkStart w:id="34" w:name="OLE_LINK15"/>
+            <w:bookmarkStart w:id="29" w:name="OLE_LINK15"/>
             <w:bookmarkEnd w:id="5"/>
             <w:bookmarkEnd w:id="10"/>
             <w:bookmarkEnd w:id="11"/>
             <w:bookmarkEnd w:id="22"/>
+          </w:p>
+          <w:p>
+            <w:pPr>
+              <w:pStyle w:val="NormalWeb"/>
+              <w:spacing w:after="240" w:afterAutospacing="0"/>
+              <w:rPr>
+                <w:rFonts w:ascii="Aptos" w:hAnsi="Aptos" w:cs="Segoe UI"/>
+                <w:color w:val="000000" w:themeColor="text1"/>
+                <w:sz w:val="22"/>
+                <w:szCs w:val="22"/>
+                <w:shd w:val="clear" w:color="auto" w:fill="FFFFFF"/>
+              </w:rPr>
+            </w:pPr>
+            <w:bookmarkStart w:id="30" w:name="OLE_LINK22"/>
+            <w:bookmarkStart w:id="31" w:name="OLE_LINK20"/>
+            <w:bookmarkStart w:id="32" w:name="OLE_LINK33"/>
+            <w:r>
+              <w:rPr>
+                <w:rFonts w:ascii="Aptos" w:hAnsi="Aptos" w:cs="Segoe UI"/>
+                <w:color w:val="000000" w:themeColor="text1"/>
+                <w:sz w:val="22"/>
+                <w:szCs w:val="22"/>
+                <w:u w:val="single"/>
+                <w:shd w:val="clear" w:color="auto" w:fill="FFFFFF"/>
+              </w:rPr>
+              <w:t>HPCDATAMGM-2188</w:t>
+            </w:r>
+            <w:r>
+              <w:rPr>
+                <w:rFonts w:ascii="Aptos" w:hAnsi="Aptos" w:cs="Segoe UI"/>
+                <w:color w:val="000000" w:themeColor="text1"/>
+                <w:sz w:val="22"/>
+                <w:szCs w:val="22"/>
+                <w:shd w:val="clear" w:color="auto" w:fill="FFFFFF"/>
+              </w:rPr>
+              <w:t xml:space="preserve">: </w:t>
+            </w:r>
+            <w:r>
+              <w:rPr>
+                <w:rFonts w:ascii="Aptos" w:hAnsi="Aptos" w:cs="Segoe UI"/>
+                <w:color w:val="000000" w:themeColor="text1"/>
+                <w:sz w:val="22"/>
+                <w:szCs w:val="22"/>
+                <w:shd w:val="clear" w:color="auto" w:fill="FFFFFF"/>
+              </w:rPr>
+              <w:t xml:space="preserve"> Doubled the JVM memory on the DME primary server to enable export of large results sets (&gt; than 100,000). </w:t>
+            </w:r>
+            <w:bookmarkEnd w:id="1"/>
+            <w:bookmarkEnd w:id="6"/>
+            <w:bookmarkEnd w:id="23"/>
             <w:bookmarkEnd w:id="29"/>
             <w:bookmarkEnd w:id="30"/>
             <w:bookmarkEnd w:id="31"/>
-            <w:bookmarkEnd w:id="32"/>
-            <w:bookmarkEnd w:id="33"/>
-          </w:p>
+          </w:p>
+          <w:p>
+            <w:pPr>
+              <w:pStyle w:val="NormalWeb"/>
+              <w:shd w:val="clear" w:color="auto" w:fill="FFFFFF"/>
+              <w:spacing w:before="0" w:beforeAutospacing="0" w:after="120" w:afterAutospacing="0"/>
+              <w:rPr>
+                <w:rFonts w:ascii="Aptos" w:hAnsi="Aptos" w:cs="Segoe UI"/>
+                <w:color w:val="000000" w:themeColor="text1"/>
+                <w:sz w:val="22"/>
+                <w:szCs w:val="22"/>
+                <w:shd w:val="clear" w:color="auto" w:fill="FFFFFF"/>
+              </w:rPr>
+            </w:pPr>
+            <w:r>
+              <w:rPr>
+                <w:rFonts w:ascii="Aptos" w:hAnsi="Aptos" w:cs="Segoe UI"/>
+                <w:color w:val="000000" w:themeColor="text1"/>
+                <w:sz w:val="22"/>
+                <w:szCs w:val="22"/>
+                <w:u w:val="single"/>
+                <w:shd w:val="clear" w:color="auto" w:fill="FFFFFF"/>
+              </w:rPr>
+              <w:t>HPCDATAMGM-2150</w:t>
+            </w:r>
+            <w:r>
+              <w:rPr>
+                <w:rFonts w:ascii="Aptos" w:hAnsi="Aptos" w:cs="Segoe UI"/>
+                <w:color w:val="000000" w:themeColor="text1"/>
+                <w:sz w:val="22"/>
+                <w:szCs w:val="22"/>
+                <w:u w:val="single"/>
+                <w:shd w:val="clear" w:color="auto" w:fill="FFFFFF"/>
+              </w:rPr>
+              <w:t>, 2190</w:t>
+            </w:r>
+            <w:r>
+              <w:rPr>
+                <w:rFonts w:ascii="Aptos" w:hAnsi="Aptos" w:cs="Segoe UI"/>
+                <w:color w:val="000000" w:themeColor="text1"/>
+                <w:sz w:val="22"/>
+                <w:szCs w:val="22"/>
+                <w:shd w:val="clear" w:color="auto" w:fill="FFFFFF"/>
+              </w:rPr>
+              <w:t xml:space="preserve">: Upgraded the Spring framework </w:t>
+            </w:r>
+            <w:r>
+              <w:rPr>
+                <w:rFonts w:ascii="Aptos" w:hAnsi="Aptos" w:cs="Segoe UI"/>
+                <w:color w:val="000000" w:themeColor="text1"/>
+                <w:sz w:val="22"/>
+                <w:szCs w:val="22"/>
+                <w:shd w:val="clear" w:color="auto" w:fill="FFFFFF"/>
+              </w:rPr>
+              <w:t xml:space="preserve">libraries </w:t>
+            </w:r>
+            <w:r>
+              <w:rPr>
+                <w:rFonts w:ascii="Aptos" w:hAnsi="Aptos" w:cs="Segoe UI"/>
+                <w:color w:val="000000" w:themeColor="text1"/>
+                <w:sz w:val="22"/>
+                <w:szCs w:val="22"/>
+                <w:shd w:val="clear" w:color="auto" w:fill="FFFFFF"/>
+              </w:rPr>
+              <w:t>in the DME API server to remediate security vulnerabilit</w:t>
+            </w:r>
+            <w:r>
+              <w:rPr>
+                <w:rFonts w:ascii="Aptos" w:hAnsi="Aptos" w:cs="Segoe UI"/>
+                <w:color w:val="000000" w:themeColor="text1"/>
+                <w:sz w:val="22"/>
+                <w:szCs w:val="22"/>
+                <w:shd w:val="clear" w:color="auto" w:fill="FFFFFF"/>
+              </w:rPr>
+              <w:t>ies</w:t>
+            </w:r>
+            <w:r>
+              <w:rPr>
+                <w:rFonts w:ascii="Aptos" w:hAnsi="Aptos" w:cs="Segoe UI"/>
+                <w:color w:val="000000" w:themeColor="text1"/>
+                <w:sz w:val="22"/>
+                <w:szCs w:val="22"/>
+                <w:shd w:val="clear" w:color="auto" w:fill="FFFFFF"/>
+              </w:rPr>
+              <w:t xml:space="preserve"> flagged by the Nessus scan.</w:t>
+            </w:r>
+          </w:p>
+          <w:bookmarkEnd w:id="32"/>
           <w:p>
             <w:pPr>
               <w:pStyle w:val="NormalWeb"/>
@@ -4360,47 +4538,6 @@
                 <w:szCs w:val="22"/>
               </w:rPr>
             </w:pPr>
-            <w:bookmarkStart w:id="35" w:name="OLE_LINK22"/>
-            <w:bookmarkStart w:id="36" w:name="OLE_LINK20"/>
-            <w:r>
-              <w:rPr>
-                <w:rFonts w:ascii="Aptos" w:hAnsi="Aptos" w:cs="Segoe UI"/>
-                <w:color w:val="000000" w:themeColor="text1"/>
-                <w:sz w:val="22"/>
-                <w:szCs w:val="22"/>
-                <w:u w:val="single"/>
-                <w:shd w:val="clear" w:color="auto" w:fill="FFFFFF"/>
-              </w:rPr>
-              <w:t>HPCDATAMGM-2188</w:t>
-            </w:r>
-            <w:r>
-              <w:rPr>
-                <w:rFonts w:ascii="Aptos" w:hAnsi="Aptos" w:cs="Segoe UI"/>
-                <w:color w:val="000000" w:themeColor="text1"/>
-                <w:sz w:val="22"/>
-                <w:szCs w:val="22"/>
-                <w:shd w:val="clear" w:color="auto" w:fill="FFFFFF"/>
-              </w:rPr>
-              <w:t xml:space="preserve">: Fixed the issue of large search exports failing due to insufficient JVM memory in the DME primary server. </w:t>
-            </w:r>
-            <w:bookmarkEnd w:id="1"/>
-            <w:bookmarkEnd w:id="6"/>
-            <w:bookmarkEnd w:id="23"/>
-            <w:bookmarkEnd w:id="34"/>
-            <w:bookmarkEnd w:id="35"/>
-            <w:bookmarkEnd w:id="36"/>
-          </w:p>
-          <w:p>
-            <w:pPr>
-              <w:pStyle w:val="NormalWeb"/>
-              <w:spacing w:after="240" w:afterAutospacing="0"/>
-              <w:rPr>
-                <w:rFonts w:ascii="Aptos" w:hAnsi="Aptos" w:cs="Segoe UI"/>
-                <w:color w:val="000000" w:themeColor="text1"/>
-                <w:sz w:val="22"/>
-                <w:szCs w:val="22"/>
-              </w:rPr>
-            </w:pPr>
           </w:p>
           <w:bookmarkEnd w:id="7"/>
           <w:p>
@@ -4430,7 +4567,7 @@
                 <w:szCs w:val="22"/>
               </w:rPr>
             </w:pPr>
-            <w:bookmarkStart w:id="37" w:name="OLE_LINK5"/>
+            <w:bookmarkStart w:id="33" w:name="OLE_LINK5"/>
           </w:p>
           <w:p>
             <w:pPr>
@@ -4806,7 +4943,7 @@
             <w:bookmarkEnd w:id="3"/>
             <w:bookmarkEnd w:id="8"/>
             <w:bookmarkEnd w:id="9"/>
-            <w:bookmarkEnd w:id="37"/>
+            <w:bookmarkEnd w:id="33"/>
           </w:p>
           <w:p>
             <w:pPr>
@@ -5131,7 +5268,6 @@
                 <w:sz w:val="22"/>
                 <w:szCs w:val="22"/>
               </w:rPr>
-              <w:lastRenderedPageBreak/>
               <w:t xml:space="preserve">You can access </w:t>
             </w:r>
             <w:r>

</xml_diff>